<commit_message>
Add V50 thesis: borromeo as category error (surface version of 4.8, closing repositioned, abstract adjusted)
Integrates the author's frame change: the borromeo is not a pending proof
but a category error - the model object is a horn-torus surface with bands
that cover and carve it, not a link in S3. Replaces the 4.8 section with
the surface version, repositions the methodological closing at the end of
Chapter 7 (V49 had it glued after the BME paragraph), swaps abstract
paragraph A3 for the surface version, and supersedes the topological
transition to "toro liso -> horn torus, chi = 0 -> 1". Adds V50 mirror,
updates traceability (V50 section + supersede note in V49 mirror) and
README.

Generated with Codebuff
Co-Authored-By: Codebuff <noreply@codebuff.com>
</commit_message>
<xml_diff>
--- a/docs/V49_escritos_completos.docx
+++ b/docs/V49_escritos_completos.docx
@@ -257,12 +257,12 @@
     </w:p>
     <w:p>
       <w:r>
-        <w:t xml:space="preserve">- **χ corregido según §4.7:** la formulación original «hace caer χ de 0 a 1» era numéricamente inconsistente con el punto 1 del §4.7 (horn torus: χ(X) = 1, H₁(X) = ℤ; separadas las hojas → esfera: χ = 2, H₁ = 0). Corona aprobada por el usuario en el turno previo como corrección pendiente; quedó «horn torus → esfera, χ = 1 → χ = 2».</w:t>
-      </w:r>
-    </w:p>
-    <w:p>
-      <w:r>
-        <w:t xml:space="preserve">- **Sinthome:** en el Cierre, la separación inexistente de lo que el usuario escribía como «[:» queda como **material en espera de la tarea (11)**, no como texto definido. La definición sigue sin definirse (correcto según V44/V47).</w:t>
+        <w:t xml:space="preserve">- **χ ajustado según §4.7:** la formulación original del usuario «hace caer χ de 0 a 1» era numéricamente inconsistente con el punto 1 del §4.7 (horn torus: χ(X) = 1, H₁(X) = ℤ; separadas las hojas → esfera: χ = 2, H₁ = 0). En el ciclo V49 quedó «horn torus → esfera, χ = 1 → χ = 2». Nota de supersede (V50): el autor adoptó después el marco de superficie para la transición — «toro liso → horn torus, χ = 0 → 1» (colapso del lazo longitudinal) —, que es la versión vigente.</w:t>
+      </w:r>
+    </w:p>
+    <w:p>
+      <w:r>
+        <w:t xml:space="preserve">- **Sinthome:** en el Cierre, la fórmula provisional del autor queda reescrita: la función del sinthome (sostener sin garantía) se formaliza como la modalidad exigida de Σ, y el cotejo de las citas queda como **material en espera de la tarea (11)**. La definición sigue sin definirse (correcto según V44/V47).</w:t>
       </w:r>
     </w:p>
     <w:p>

</xml_diff>